<commit_message>
feat(ru): update templates from SportOrg 30d849d, keep one cleaned docx
ru/ now holds sportorg/data/templates of SportOrg commit
30d849dde1f7ebe04599098b3344b72fdb1210fe (branch templates): 61 HTML
templates, byte-identical to that commit (23 new, 28 changed).

All .docx templates are removed from the tree; the earlier ones remain in
history. Their text or document properties carry contact details and author
names. The only .docx kept is reports/диплом_Кубок_России_word.docx, re-saved
with empty author, last-modified-by and company properties; its text and its
25 template tags are unchanged.
</commit_message>
<xml_diff>
--- a/ru/reports/диплом_Кубок_России_word.docx
+++ b/ru/reports/диплом_Кубок_России_word.docx
@@ -1,6 +1,6 @@
 
 <file path=word/document.xml><?xml version="1.0" encoding="utf-8"?>
-<w:document xmlns:wpc="http://schemas.microsoft.com/office/word/2010/wordprocessingCanvas" xmlns:cx="http://schemas.microsoft.com/office/drawing/2014/chartex" xmlns:mc="http://schemas.openxmlformats.org/markup-compatibility/2006" xmlns:o="urn:schemas-microsoft-com:office:office" xmlns:r="http://schemas.openxmlformats.org/officeDocument/2006/relationships" xmlns:m="http://schemas.openxmlformats.org/officeDocument/2006/math" xmlns:v="urn:schemas-microsoft-com:vml" xmlns:wp14="http://schemas.microsoft.com/office/word/2010/wordprocessingDrawing" xmlns:wp="http://schemas.openxmlformats.org/drawingml/2006/wordprocessingDrawing" xmlns:w10="urn:schemas-microsoft-com:office:word" xmlns:w="http://schemas.openxmlformats.org/wordprocessingml/2006/main" xmlns:w14="http://schemas.microsoft.com/office/word/2010/wordml" xmlns:w15="http://schemas.microsoft.com/office/word/2012/wordml" xmlns:w16se="http://schemas.microsoft.com/office/word/2015/wordml/symex" xmlns:wpg="http://schemas.microsoft.com/office/word/2010/wordprocessingGroup" xmlns:wpi="http://schemas.microsoft.com/office/word/2010/wordprocessingInk" xmlns:wne="http://schemas.microsoft.com/office/word/2006/wordml" xmlns:wps="http://schemas.microsoft.com/office/word/2010/wordprocessingShape" mc:Ignorable="w14 w15 w16se wp14">
+<w:document xmlns:wpc="http://schemas.microsoft.com/office/word/2010/wordprocessingCanvas" xmlns:cx="http://schemas.microsoft.com/office/drawing/2014/chartex" xmlns:cx1="http://schemas.microsoft.com/office/drawing/2015/9/8/chartex" xmlns:cx2="http://schemas.microsoft.com/office/drawing/2015/10/21/chartex" xmlns:cx3="http://schemas.microsoft.com/office/drawing/2016/5/9/chartex" xmlns:cx4="http://schemas.microsoft.com/office/drawing/2016/5/10/chartex" xmlns:cx5="http://schemas.microsoft.com/office/drawing/2016/5/11/chartex" xmlns:cx6="http://schemas.microsoft.com/office/drawing/2016/5/12/chartex" xmlns:cx7="http://schemas.microsoft.com/office/drawing/2016/5/13/chartex" xmlns:cx8="http://schemas.microsoft.com/office/drawing/2016/5/14/chartex" xmlns:mc="http://schemas.openxmlformats.org/markup-compatibility/2006" xmlns:aink="http://schemas.microsoft.com/office/drawing/2016/ink" xmlns:am3d="http://schemas.microsoft.com/office/drawing/2017/model3d" xmlns:o="urn:schemas-microsoft-com:office:office" xmlns:oel="http://schemas.microsoft.com/office/2019/extlst" xmlns:r="http://schemas.openxmlformats.org/officeDocument/2006/relationships" xmlns:m="http://schemas.openxmlformats.org/officeDocument/2006/math" xmlns:v="urn:schemas-microsoft-com:vml" xmlns:wp14="http://schemas.microsoft.com/office/word/2010/wordprocessingDrawing" xmlns:wp="http://schemas.openxmlformats.org/drawingml/2006/wordprocessingDrawing" xmlns:w10="urn:schemas-microsoft-com:office:word" xmlns:w="http://schemas.openxmlformats.org/wordprocessingml/2006/main" xmlns:w14="http://schemas.microsoft.com/office/word/2010/wordml" xmlns:w15="http://schemas.microsoft.com/office/word/2012/wordml" xmlns:w16cex="http://schemas.microsoft.com/office/word/2018/wordml/cex" xmlns:w16cid="http://schemas.microsoft.com/office/word/2016/wordml/cid" xmlns:w16="http://schemas.microsoft.com/office/word/2018/wordml" xmlns:w16du="http://schemas.microsoft.com/office/word/2023/wordml/word16du" xmlns:w16sdtdh="http://schemas.microsoft.com/office/word/2020/wordml/sdtdatahash" xmlns:w16sdtfl="http://schemas.microsoft.com/office/word/2024/wordml/sdtformatlock" xmlns:w16se="http://schemas.microsoft.com/office/word/2015/wordml/symex" xmlns:wpg="http://schemas.microsoft.com/office/word/2010/wordprocessingGroup" xmlns:wpi="http://schemas.microsoft.com/office/word/2010/wordprocessingInk" xmlns:wne="http://schemas.microsoft.com/office/word/2006/wordml" xmlns:wps="http://schemas.microsoft.com/office/word/2010/wordprocessingShape" mc:Ignorable="w14 w15 w16se w16cid w16 w16cex w16sdtdh w16sdtfl w16du wp14">
   <w:body>
     <w:p>
       <w:pPr>
@@ -88,8 +88,21 @@
           <w:szCs w:val="6"/>
           <w:lang w:val="en-US"/>
         </w:rPr>
-        <w:t>str, len</w:t>
-      </w:r>
+        <w:t xml:space="preserve">str, </w:t>
+      </w:r>
+      <w:proofErr w:type="spellStart"/>
+      <w:r>
+        <w:rPr>
+          <w:rStyle w:val="nv"/>
+          <w:rFonts w:ascii="Arial" w:hAnsi="Arial" w:cs="Arial"/>
+          <w:color w:val="7030A0"/>
+          <w:sz w:val="6"/>
+          <w:szCs w:val="6"/>
+          <w:lang w:val="en-US"/>
+        </w:rPr>
+        <w:t>len</w:t>
+      </w:r>
+      <w:proofErr w:type="spellEnd"/>
       <w:r>
         <w:rPr>
           <w:rStyle w:val="o"/>
@@ -128,6 +141,7 @@
         </w:rPr>
         <w:t>(</w:t>
       </w:r>
+      <w:proofErr w:type="spellStart"/>
       <w:r>
         <w:rPr>
           <w:sz w:val="6"/>
@@ -144,6 +158,7 @@
         </w:rPr>
         <w:t>|string</w:t>
       </w:r>
+      <w:proofErr w:type="spellEnd"/>
       <w:r>
         <w:rPr>
           <w:sz w:val="6"/>
@@ -158,15 +173,69 @@
           <w:szCs w:val="6"/>
           <w:lang w:val="en-US"/>
         </w:rPr>
-        <w:t>[:len]</w:t>
-      </w:r>
-      <w:r>
-        <w:rPr>
-          <w:sz w:val="6"/>
-          <w:szCs w:val="6"/>
-          <w:lang w:val="en-US"/>
-        </w:rPr>
-        <w:t>}}{% for i in range(0,(len-</w:t>
+        <w:t>[:</w:t>
+      </w:r>
+      <w:proofErr w:type="spellStart"/>
+      <w:r>
+        <w:rPr>
+          <w:sz w:val="6"/>
+          <w:szCs w:val="6"/>
+          <w:lang w:val="en-US"/>
+        </w:rPr>
+        <w:t>len</w:t>
+      </w:r>
+      <w:proofErr w:type="spellEnd"/>
+      <w:r>
+        <w:rPr>
+          <w:sz w:val="6"/>
+          <w:szCs w:val="6"/>
+          <w:lang w:val="en-US"/>
+        </w:rPr>
+        <w:t>]</w:t>
+      </w:r>
+      <w:r>
+        <w:rPr>
+          <w:sz w:val="6"/>
+          <w:szCs w:val="6"/>
+          <w:lang w:val="en-US"/>
+        </w:rPr>
+        <w:t xml:space="preserve">}}{% for </w:t>
+      </w:r>
+      <w:proofErr w:type="spellStart"/>
+      <w:r>
+        <w:rPr>
+          <w:sz w:val="6"/>
+          <w:szCs w:val="6"/>
+          <w:lang w:val="en-US"/>
+        </w:rPr>
+        <w:t>i</w:t>
+      </w:r>
+      <w:proofErr w:type="spellEnd"/>
+      <w:r>
+        <w:rPr>
+          <w:sz w:val="6"/>
+          <w:szCs w:val="6"/>
+          <w:lang w:val="en-US"/>
+        </w:rPr>
+        <w:t xml:space="preserve"> in range(0,(</w:t>
+      </w:r>
+      <w:proofErr w:type="spellStart"/>
+      <w:r>
+        <w:rPr>
+          <w:sz w:val="6"/>
+          <w:szCs w:val="6"/>
+          <w:lang w:val="en-US"/>
+        </w:rPr>
+        <w:t>len</w:t>
+      </w:r>
+      <w:proofErr w:type="spellEnd"/>
+      <w:r>
+        <w:rPr>
+          <w:sz w:val="6"/>
+          <w:szCs w:val="6"/>
+          <w:lang w:val="en-US"/>
+        </w:rPr>
+        <w:t>-</w:t>
       </w:r>
       <w:r>
         <w:rPr>
@@ -176,6 +245,7 @@
         </w:rPr>
         <w:t>(</w:t>
       </w:r>
+      <w:proofErr w:type="spellStart"/>
       <w:r>
         <w:rPr>
           <w:sz w:val="6"/>
@@ -192,6 +262,7 @@
         </w:rPr>
         <w:t>|string</w:t>
       </w:r>
+      <w:proofErr w:type="spellEnd"/>
       <w:r>
         <w:rPr>
           <w:sz w:val="6"/>
@@ -206,7 +277,25 @@
           <w:szCs w:val="6"/>
           <w:lang w:val="en-US"/>
         </w:rPr>
-        <w:t>[:len]</w:t>
+        <w:t>[:</w:t>
+      </w:r>
+      <w:proofErr w:type="spellStart"/>
+      <w:r>
+        <w:rPr>
+          <w:sz w:val="6"/>
+          <w:szCs w:val="6"/>
+          <w:lang w:val="en-US"/>
+        </w:rPr>
+        <w:t>len</w:t>
+      </w:r>
+      <w:proofErr w:type="spellEnd"/>
+      <w:r>
+        <w:rPr>
+          <w:sz w:val="6"/>
+          <w:szCs w:val="6"/>
+          <w:lang w:val="en-US"/>
+        </w:rPr>
+        <w:t>]</w:t>
       </w:r>
       <w:r>
         <w:rPr>
@@ -230,7 +319,25 @@
           <w:szCs w:val="6"/>
           <w:lang w:val="en-US"/>
         </w:rPr>
-        <w:t>{% endfor %}</w:t>
+        <w:t xml:space="preserve">{% </w:t>
+      </w:r>
+      <w:proofErr w:type="spellStart"/>
+      <w:r>
+        <w:rPr>
+          <w:sz w:val="6"/>
+          <w:szCs w:val="6"/>
+          <w:lang w:val="en-US"/>
+        </w:rPr>
+        <w:t>endfor</w:t>
+      </w:r>
+      <w:proofErr w:type="spellEnd"/>
+      <w:r>
+        <w:rPr>
+          <w:sz w:val="6"/>
+          <w:szCs w:val="6"/>
+          <w:lang w:val="en-US"/>
+        </w:rPr>
+        <w:t xml:space="preserve"> %}</w:t>
       </w:r>
       <w:r>
         <w:rPr>
@@ -254,6 +361,7 @@
         </w:rPr>
         <w:t xml:space="preserve"> </w:t>
       </w:r>
+      <w:proofErr w:type="spellStart"/>
       <w:r>
         <w:rPr>
           <w:rStyle w:val="k"/>
@@ -266,6 +374,7 @@
         </w:rPr>
         <w:t>endmacro</w:t>
       </w:r>
+      <w:proofErr w:type="spellEnd"/>
       <w:r>
         <w:rPr>
           <w:rStyle w:val="k"/>
@@ -610,8 +719,20 @@
           <w:szCs w:val="6"/>
           <w:lang w:val="en-US"/>
         </w:rPr>
-        <w:t>{% endmacro</w:t>
-      </w:r>
+        <w:t xml:space="preserve">{% </w:t>
+      </w:r>
+      <w:proofErr w:type="spellStart"/>
+      <w:r>
+        <w:rPr>
+          <w:rFonts w:ascii="Arial" w:hAnsi="Arial" w:cs="Arial"/>
+          <w:color w:val="7030A0"/>
+          <w:sz w:val="6"/>
+          <w:szCs w:val="6"/>
+          <w:lang w:val="en-US"/>
+        </w:rPr>
+        <w:t>endmacro</w:t>
+      </w:r>
+      <w:proofErr w:type="spellEnd"/>
       <w:r>
         <w:rPr>
           <w:rFonts w:ascii="Arial" w:hAnsi="Arial" w:cs="Arial"/>
@@ -640,7 +761,51 @@
           <w:szCs w:val="6"/>
           <w:lang w:val="en-US"/>
         </w:rPr>
-        <w:t>{% for result in race.results | selectattr("place", "</w:t>
+        <w:t xml:space="preserve">{% for result in </w:t>
+      </w:r>
+      <w:proofErr w:type="spellStart"/>
+      <w:r>
+        <w:rPr>
+          <w:rFonts w:ascii="Arial" w:hAnsi="Arial" w:cs="Arial"/>
+          <w:color w:val="7030A0"/>
+          <w:sz w:val="6"/>
+          <w:szCs w:val="6"/>
+          <w:lang w:val="en-US"/>
+        </w:rPr>
+        <w:t>race.results</w:t>
+      </w:r>
+      <w:proofErr w:type="spellEnd"/>
+      <w:r>
+        <w:rPr>
+          <w:rFonts w:ascii="Arial" w:hAnsi="Arial" w:cs="Arial"/>
+          <w:color w:val="7030A0"/>
+          <w:sz w:val="6"/>
+          <w:szCs w:val="6"/>
+          <w:lang w:val="en-US"/>
+        </w:rPr>
+        <w:t xml:space="preserve"> | </w:t>
+      </w:r>
+      <w:proofErr w:type="spellStart"/>
+      <w:r>
+        <w:rPr>
+          <w:rFonts w:ascii="Arial" w:hAnsi="Arial" w:cs="Arial"/>
+          <w:color w:val="7030A0"/>
+          <w:sz w:val="6"/>
+          <w:szCs w:val="6"/>
+          <w:lang w:val="en-US"/>
+        </w:rPr>
+        <w:t>selectattr</w:t>
+      </w:r>
+      <w:proofErr w:type="spellEnd"/>
+      <w:r>
+        <w:rPr>
+          <w:rFonts w:ascii="Arial" w:hAnsi="Arial" w:cs="Arial"/>
+          <w:color w:val="7030A0"/>
+          <w:sz w:val="6"/>
+          <w:szCs w:val="6"/>
+          <w:lang w:val="en-US"/>
+        </w:rPr>
+        <w:t>("place", "</w:t>
       </w:r>
       <w:r>
         <w:rPr>
@@ -670,7 +835,29 @@
           <w:szCs w:val="6"/>
           <w:lang w:val="en-US"/>
         </w:rPr>
-        <w:t xml:space="preserve"> | selectattr("place", "&gt;", 0) </w:t>
+        <w:t xml:space="preserve"> | </w:t>
+      </w:r>
+      <w:proofErr w:type="spellStart"/>
+      <w:r>
+        <w:rPr>
+          <w:rFonts w:ascii="Arial" w:hAnsi="Arial" w:cs="Arial"/>
+          <w:color w:val="7030A0"/>
+          <w:sz w:val="6"/>
+          <w:szCs w:val="6"/>
+          <w:lang w:val="en-US"/>
+        </w:rPr>
+        <w:t>selectattr</w:t>
+      </w:r>
+      <w:proofErr w:type="spellEnd"/>
+      <w:r>
+        <w:rPr>
+          <w:rFonts w:ascii="Arial" w:hAnsi="Arial" w:cs="Arial"/>
+          <w:color w:val="7030A0"/>
+          <w:sz w:val="6"/>
+          <w:szCs w:val="6"/>
+          <w:lang w:val="en-US"/>
+        </w:rPr>
+        <w:t xml:space="preserve">("place", "&gt;", 0) </w:t>
       </w:r>
       <w:r>
         <w:rPr>
@@ -690,17 +877,259 @@
           <w:szCs w:val="6"/>
           <w:lang w:val="en-US"/>
         </w:rPr>
-        <w:t>{% for group in race.groups -%}</w:t>
-      </w:r>
-      <w:r>
-        <w:rPr>
-          <w:rFonts w:ascii="Arial" w:hAnsi="Arial" w:cs="Arial"/>
-          <w:color w:val="7030A0"/>
-          <w:sz w:val="6"/>
-          <w:szCs w:val="6"/>
-          <w:lang w:val="en-US"/>
-        </w:rPr>
-        <w:t>{% for person in race.persons | selectattr("id", "equalto", result.person_id) | selectattr("group_id", "equalto", group.id) %}{% for team in race.organizations|selectattr("id", "equalto", person.organization_id) %}</w:t>
+        <w:t xml:space="preserve">{% for group in </w:t>
+      </w:r>
+      <w:proofErr w:type="spellStart"/>
+      <w:r>
+        <w:rPr>
+          <w:rFonts w:ascii="Arial" w:hAnsi="Arial" w:cs="Arial"/>
+          <w:color w:val="7030A0"/>
+          <w:sz w:val="6"/>
+          <w:szCs w:val="6"/>
+          <w:lang w:val="en-US"/>
+        </w:rPr>
+        <w:t>race.groups</w:t>
+      </w:r>
+      <w:proofErr w:type="spellEnd"/>
+      <w:r>
+        <w:rPr>
+          <w:rFonts w:ascii="Arial" w:hAnsi="Arial" w:cs="Arial"/>
+          <w:color w:val="7030A0"/>
+          <w:sz w:val="6"/>
+          <w:szCs w:val="6"/>
+          <w:lang w:val="en-US"/>
+        </w:rPr>
+        <w:t xml:space="preserve"> -%}</w:t>
+      </w:r>
+      <w:r>
+        <w:rPr>
+          <w:rFonts w:ascii="Arial" w:hAnsi="Arial" w:cs="Arial"/>
+          <w:color w:val="7030A0"/>
+          <w:sz w:val="6"/>
+          <w:szCs w:val="6"/>
+          <w:lang w:val="en-US"/>
+        </w:rPr>
+        <w:t xml:space="preserve">{% for person in </w:t>
+      </w:r>
+      <w:proofErr w:type="spellStart"/>
+      <w:r>
+        <w:rPr>
+          <w:rFonts w:ascii="Arial" w:hAnsi="Arial" w:cs="Arial"/>
+          <w:color w:val="7030A0"/>
+          <w:sz w:val="6"/>
+          <w:szCs w:val="6"/>
+          <w:lang w:val="en-US"/>
+        </w:rPr>
+        <w:t>race.persons</w:t>
+      </w:r>
+      <w:proofErr w:type="spellEnd"/>
+      <w:r>
+        <w:rPr>
+          <w:rFonts w:ascii="Arial" w:hAnsi="Arial" w:cs="Arial"/>
+          <w:color w:val="7030A0"/>
+          <w:sz w:val="6"/>
+          <w:szCs w:val="6"/>
+          <w:lang w:val="en-US"/>
+        </w:rPr>
+        <w:t xml:space="preserve"> | </w:t>
+      </w:r>
+      <w:proofErr w:type="spellStart"/>
+      <w:r>
+        <w:rPr>
+          <w:rFonts w:ascii="Arial" w:hAnsi="Arial" w:cs="Arial"/>
+          <w:color w:val="7030A0"/>
+          <w:sz w:val="6"/>
+          <w:szCs w:val="6"/>
+          <w:lang w:val="en-US"/>
+        </w:rPr>
+        <w:t>selectattr</w:t>
+      </w:r>
+      <w:proofErr w:type="spellEnd"/>
+      <w:r>
+        <w:rPr>
+          <w:rFonts w:ascii="Arial" w:hAnsi="Arial" w:cs="Arial"/>
+          <w:color w:val="7030A0"/>
+          <w:sz w:val="6"/>
+          <w:szCs w:val="6"/>
+          <w:lang w:val="en-US"/>
+        </w:rPr>
+        <w:t>("id", "</w:t>
+      </w:r>
+      <w:proofErr w:type="spellStart"/>
+      <w:r>
+        <w:rPr>
+          <w:rFonts w:ascii="Arial" w:hAnsi="Arial" w:cs="Arial"/>
+          <w:color w:val="7030A0"/>
+          <w:sz w:val="6"/>
+          <w:szCs w:val="6"/>
+          <w:lang w:val="en-US"/>
+        </w:rPr>
+        <w:t>equalto</w:t>
+      </w:r>
+      <w:proofErr w:type="spellEnd"/>
+      <w:r>
+        <w:rPr>
+          <w:rFonts w:ascii="Arial" w:hAnsi="Arial" w:cs="Arial"/>
+          <w:color w:val="7030A0"/>
+          <w:sz w:val="6"/>
+          <w:szCs w:val="6"/>
+          <w:lang w:val="en-US"/>
+        </w:rPr>
+        <w:t xml:space="preserve">", </w:t>
+      </w:r>
+      <w:proofErr w:type="spellStart"/>
+      <w:r>
+        <w:rPr>
+          <w:rFonts w:ascii="Arial" w:hAnsi="Arial" w:cs="Arial"/>
+          <w:color w:val="7030A0"/>
+          <w:sz w:val="6"/>
+          <w:szCs w:val="6"/>
+          <w:lang w:val="en-US"/>
+        </w:rPr>
+        <w:t>result.person_id</w:t>
+      </w:r>
+      <w:proofErr w:type="spellEnd"/>
+      <w:r>
+        <w:rPr>
+          <w:rFonts w:ascii="Arial" w:hAnsi="Arial" w:cs="Arial"/>
+          <w:color w:val="7030A0"/>
+          <w:sz w:val="6"/>
+          <w:szCs w:val="6"/>
+          <w:lang w:val="en-US"/>
+        </w:rPr>
+        <w:t xml:space="preserve">) | </w:t>
+      </w:r>
+      <w:proofErr w:type="spellStart"/>
+      <w:r>
+        <w:rPr>
+          <w:rFonts w:ascii="Arial" w:hAnsi="Arial" w:cs="Arial"/>
+          <w:color w:val="7030A0"/>
+          <w:sz w:val="6"/>
+          <w:szCs w:val="6"/>
+          <w:lang w:val="en-US"/>
+        </w:rPr>
+        <w:t>selectattr</w:t>
+      </w:r>
+      <w:proofErr w:type="spellEnd"/>
+      <w:r>
+        <w:rPr>
+          <w:rFonts w:ascii="Arial" w:hAnsi="Arial" w:cs="Arial"/>
+          <w:color w:val="7030A0"/>
+          <w:sz w:val="6"/>
+          <w:szCs w:val="6"/>
+          <w:lang w:val="en-US"/>
+        </w:rPr>
+        <w:t>("</w:t>
+      </w:r>
+      <w:proofErr w:type="spellStart"/>
+      <w:r>
+        <w:rPr>
+          <w:rFonts w:ascii="Arial" w:hAnsi="Arial" w:cs="Arial"/>
+          <w:color w:val="7030A0"/>
+          <w:sz w:val="6"/>
+          <w:szCs w:val="6"/>
+          <w:lang w:val="en-US"/>
+        </w:rPr>
+        <w:t>group_id</w:t>
+      </w:r>
+      <w:proofErr w:type="spellEnd"/>
+      <w:r>
+        <w:rPr>
+          <w:rFonts w:ascii="Arial" w:hAnsi="Arial" w:cs="Arial"/>
+          <w:color w:val="7030A0"/>
+          <w:sz w:val="6"/>
+          <w:szCs w:val="6"/>
+          <w:lang w:val="en-US"/>
+        </w:rPr>
+        <w:t>", "</w:t>
+      </w:r>
+      <w:proofErr w:type="spellStart"/>
+      <w:r>
+        <w:rPr>
+          <w:rFonts w:ascii="Arial" w:hAnsi="Arial" w:cs="Arial"/>
+          <w:color w:val="7030A0"/>
+          <w:sz w:val="6"/>
+          <w:szCs w:val="6"/>
+          <w:lang w:val="en-US"/>
+        </w:rPr>
+        <w:t>equalto</w:t>
+      </w:r>
+      <w:proofErr w:type="spellEnd"/>
+      <w:r>
+        <w:rPr>
+          <w:rFonts w:ascii="Arial" w:hAnsi="Arial" w:cs="Arial"/>
+          <w:color w:val="7030A0"/>
+          <w:sz w:val="6"/>
+          <w:szCs w:val="6"/>
+          <w:lang w:val="en-US"/>
+        </w:rPr>
+        <w:t xml:space="preserve">", group.id) %}{% for team in </w:t>
+      </w:r>
+      <w:proofErr w:type="spellStart"/>
+      <w:r>
+        <w:rPr>
+          <w:rFonts w:ascii="Arial" w:hAnsi="Arial" w:cs="Arial"/>
+          <w:color w:val="7030A0"/>
+          <w:sz w:val="6"/>
+          <w:szCs w:val="6"/>
+          <w:lang w:val="en-US"/>
+        </w:rPr>
+        <w:t>race.organizations|selectattr</w:t>
+      </w:r>
+      <w:proofErr w:type="spellEnd"/>
+      <w:r>
+        <w:rPr>
+          <w:rFonts w:ascii="Arial" w:hAnsi="Arial" w:cs="Arial"/>
+          <w:color w:val="7030A0"/>
+          <w:sz w:val="6"/>
+          <w:szCs w:val="6"/>
+          <w:lang w:val="en-US"/>
+        </w:rPr>
+        <w:t>("id", "</w:t>
+      </w:r>
+      <w:proofErr w:type="spellStart"/>
+      <w:r>
+        <w:rPr>
+          <w:rFonts w:ascii="Arial" w:hAnsi="Arial" w:cs="Arial"/>
+          <w:color w:val="7030A0"/>
+          <w:sz w:val="6"/>
+          <w:szCs w:val="6"/>
+          <w:lang w:val="en-US"/>
+        </w:rPr>
+        <w:t>equalto</w:t>
+      </w:r>
+      <w:proofErr w:type="spellEnd"/>
+      <w:r>
+        <w:rPr>
+          <w:rFonts w:ascii="Arial" w:hAnsi="Arial" w:cs="Arial"/>
+          <w:color w:val="7030A0"/>
+          <w:sz w:val="6"/>
+          <w:szCs w:val="6"/>
+          <w:lang w:val="en-US"/>
+        </w:rPr>
+        <w:t xml:space="preserve">", </w:t>
+      </w:r>
+      <w:proofErr w:type="spellStart"/>
+      <w:r>
+        <w:rPr>
+          <w:rFonts w:ascii="Arial" w:hAnsi="Arial" w:cs="Arial"/>
+          <w:color w:val="7030A0"/>
+          <w:sz w:val="6"/>
+          <w:szCs w:val="6"/>
+          <w:lang w:val="en-US"/>
+        </w:rPr>
+        <w:t>person.organization_id</w:t>
+      </w:r>
+      <w:proofErr w:type="spellEnd"/>
+      <w:r>
+        <w:rPr>
+          <w:rFonts w:ascii="Arial" w:hAnsi="Arial" w:cs="Arial"/>
+          <w:color w:val="7030A0"/>
+          <w:sz w:val="6"/>
+          <w:szCs w:val="6"/>
+          <w:lang w:val="en-US"/>
+        </w:rPr>
+        <w:t>) %}</w:t>
       </w:r>
     </w:p>
     <w:p>
@@ -746,8 +1175,6 @@
           <w:lang w:val="en-US"/>
         </w:rPr>
       </w:pPr>
-      <w:bookmarkStart w:id="0" w:name="_GoBack"/>
-      <w:bookmarkEnd w:id="0"/>
     </w:p>
     <w:p>
       <w:pPr>
@@ -830,6 +1257,8 @@
         </w:rPr>
         <w:t>{{</w:t>
       </w:r>
+      <w:proofErr w:type="spellStart"/>
+      <w:proofErr w:type="gramStart"/>
       <w:r>
         <w:rPr>
           <w:b/>
@@ -854,6 +1283,8 @@
         </w:rPr>
         <w:t>surname</w:t>
       </w:r>
+      <w:proofErr w:type="spellEnd"/>
+      <w:proofErr w:type="gramEnd"/>
       <w:r>
         <w:rPr>
           <w:b/>
@@ -941,6 +1372,7 @@
         </w:rPr>
         <w:t>{{</w:t>
       </w:r>
+      <w:proofErr w:type="gramStart"/>
       <w:r>
         <w:rPr>
           <w:b/>
@@ -964,6 +1396,7 @@
         </w:rPr>
         <w:t>place</w:t>
       </w:r>
+      <w:proofErr w:type="gramEnd"/>
       <w:r>
         <w:rPr>
           <w:b/>
@@ -1192,6 +1625,7 @@
         </w:rPr>
         <w:t>: {{</w:t>
       </w:r>
+      <w:proofErr w:type="gramStart"/>
       <w:r>
         <w:rPr>
           <w:b/>
@@ -1215,6 +1649,7 @@
         </w:rPr>
         <w:t>result</w:t>
       </w:r>
+      <w:proofErr w:type="gramEnd"/>
       <w:r>
         <w:rPr>
           <w:b/>
@@ -1267,6 +1702,7 @@
         </w:rPr>
         <w:t>.</w:t>
       </w:r>
+      <w:proofErr w:type="gramStart"/>
       <w:r>
         <w:rPr>
           <w:b/>
@@ -1290,6 +1726,7 @@
         </w:rPr>
         <w:t>location</w:t>
       </w:r>
+      <w:proofErr w:type="gramEnd"/>
       <w:r>
         <w:rPr>
           <w:b/>
@@ -1440,6 +1877,7 @@
         <w:lastRenderedPageBreak/>
         <w:t xml:space="preserve">{% </w:t>
       </w:r>
+      <w:proofErr w:type="spellStart"/>
       <w:r>
         <w:rPr>
           <w:color w:val="7030A0"/>
@@ -1449,22 +1887,42 @@
         </w:rPr>
         <w:t>endfor</w:t>
       </w:r>
-      <w:r>
-        <w:rPr>
-          <w:color w:val="7030A0"/>
-          <w:sz w:val="6"/>
-          <w:szCs w:val="6"/>
-        </w:rPr>
-        <w:t xml:space="preserve"> %}</w:t>
-      </w:r>
-      <w:r>
-        <w:rPr>
-          <w:color w:val="7030A0"/>
-          <w:sz w:val="6"/>
-          <w:szCs w:val="6"/>
-        </w:rPr>
-        <w:t xml:space="preserve">{% </w:t>
-      </w:r>
+      <w:proofErr w:type="spellEnd"/>
+      <w:r>
+        <w:rPr>
+          <w:color w:val="7030A0"/>
+          <w:sz w:val="6"/>
+          <w:szCs w:val="6"/>
+        </w:rPr>
+        <w:t xml:space="preserve"> </w:t>
+      </w:r>
+      <w:proofErr w:type="gramStart"/>
+      <w:r>
+        <w:rPr>
+          <w:color w:val="7030A0"/>
+          <w:sz w:val="6"/>
+          <w:szCs w:val="6"/>
+        </w:rPr>
+        <w:t>%}</w:t>
+      </w:r>
+      <w:r>
+        <w:rPr>
+          <w:color w:val="7030A0"/>
+          <w:sz w:val="6"/>
+          <w:szCs w:val="6"/>
+        </w:rPr>
+        <w:t>{</w:t>
+      </w:r>
+      <w:proofErr w:type="gramEnd"/>
+      <w:r>
+        <w:rPr>
+          <w:color w:val="7030A0"/>
+          <w:sz w:val="6"/>
+          <w:szCs w:val="6"/>
+        </w:rPr>
+        <w:t xml:space="preserve">% </w:t>
+      </w:r>
+      <w:proofErr w:type="spellStart"/>
       <w:r>
         <w:rPr>
           <w:color w:val="7030A0"/>
@@ -1474,22 +1932,42 @@
         </w:rPr>
         <w:t>endfor</w:t>
       </w:r>
-      <w:r>
-        <w:rPr>
-          <w:color w:val="7030A0"/>
-          <w:sz w:val="6"/>
-          <w:szCs w:val="6"/>
-        </w:rPr>
-        <w:t xml:space="preserve"> %}</w:t>
-      </w:r>
-      <w:r>
-        <w:rPr>
-          <w:color w:val="7030A0"/>
-          <w:sz w:val="6"/>
-          <w:szCs w:val="6"/>
-        </w:rPr>
-        <w:t xml:space="preserve">{% </w:t>
-      </w:r>
+      <w:proofErr w:type="spellEnd"/>
+      <w:r>
+        <w:rPr>
+          <w:color w:val="7030A0"/>
+          <w:sz w:val="6"/>
+          <w:szCs w:val="6"/>
+        </w:rPr>
+        <w:t xml:space="preserve"> </w:t>
+      </w:r>
+      <w:proofErr w:type="gramStart"/>
+      <w:r>
+        <w:rPr>
+          <w:color w:val="7030A0"/>
+          <w:sz w:val="6"/>
+          <w:szCs w:val="6"/>
+        </w:rPr>
+        <w:t>%}</w:t>
+      </w:r>
+      <w:r>
+        <w:rPr>
+          <w:color w:val="7030A0"/>
+          <w:sz w:val="6"/>
+          <w:szCs w:val="6"/>
+        </w:rPr>
+        <w:t>{</w:t>
+      </w:r>
+      <w:proofErr w:type="gramEnd"/>
+      <w:r>
+        <w:rPr>
+          <w:color w:val="7030A0"/>
+          <w:sz w:val="6"/>
+          <w:szCs w:val="6"/>
+        </w:rPr>
+        <w:t xml:space="preserve">% </w:t>
+      </w:r>
+      <w:proofErr w:type="spellStart"/>
       <w:r>
         <w:rPr>
           <w:color w:val="7030A0"/>
@@ -1499,14 +1977,34 @@
         </w:rPr>
         <w:t>endfor</w:t>
       </w:r>
-      <w:r>
-        <w:rPr>
-          <w:color w:val="7030A0"/>
-          <w:sz w:val="6"/>
-          <w:szCs w:val="6"/>
-        </w:rPr>
-        <w:t xml:space="preserve"> %}{% </w:t>
-      </w:r>
+      <w:proofErr w:type="spellEnd"/>
+      <w:r>
+        <w:rPr>
+          <w:color w:val="7030A0"/>
+          <w:sz w:val="6"/>
+          <w:szCs w:val="6"/>
+        </w:rPr>
+        <w:t xml:space="preserve"> </w:t>
+      </w:r>
+      <w:proofErr w:type="gramStart"/>
+      <w:r>
+        <w:rPr>
+          <w:color w:val="7030A0"/>
+          <w:sz w:val="6"/>
+          <w:szCs w:val="6"/>
+        </w:rPr>
+        <w:t>%}{</w:t>
+      </w:r>
+      <w:proofErr w:type="gramEnd"/>
+      <w:r>
+        <w:rPr>
+          <w:color w:val="7030A0"/>
+          <w:sz w:val="6"/>
+          <w:szCs w:val="6"/>
+        </w:rPr>
+        <w:t xml:space="preserve">% </w:t>
+      </w:r>
+      <w:proofErr w:type="spellStart"/>
       <w:r>
         <w:rPr>
           <w:color w:val="7030A0"/>
@@ -1516,6 +2014,7 @@
         </w:rPr>
         <w:t>endfor</w:t>
       </w:r>
+      <w:proofErr w:type="spellEnd"/>
       <w:r>
         <w:rPr>
           <w:color w:val="7030A0"/>
@@ -1537,7 +2036,7 @@
 </file>
 
 <file path=word/endnotes.xml><?xml version="1.0" encoding="utf-8"?>
-<w:endnotes xmlns:wpc="http://schemas.microsoft.com/office/word/2010/wordprocessingCanvas" xmlns:cx="http://schemas.microsoft.com/office/drawing/2014/chartex" xmlns:mc="http://schemas.openxmlformats.org/markup-compatibility/2006" xmlns:o="urn:schemas-microsoft-com:office:office" xmlns:r="http://schemas.openxmlformats.org/officeDocument/2006/relationships" xmlns:m="http://schemas.openxmlformats.org/officeDocument/2006/math" xmlns:v="urn:schemas-microsoft-com:vml" xmlns:wp14="http://schemas.microsoft.com/office/word/2010/wordprocessingDrawing" xmlns:wp="http://schemas.openxmlformats.org/drawingml/2006/wordprocessingDrawing" xmlns:w10="urn:schemas-microsoft-com:office:word" xmlns:w="http://schemas.openxmlformats.org/wordprocessingml/2006/main" xmlns:w14="http://schemas.microsoft.com/office/word/2010/wordml" xmlns:w15="http://schemas.microsoft.com/office/word/2012/wordml" xmlns:w16se="http://schemas.microsoft.com/office/word/2015/wordml/symex" xmlns:wpg="http://schemas.microsoft.com/office/word/2010/wordprocessingGroup" xmlns:wpi="http://schemas.microsoft.com/office/word/2010/wordprocessingInk" xmlns:wne="http://schemas.microsoft.com/office/word/2006/wordml" xmlns:wps="http://schemas.microsoft.com/office/word/2010/wordprocessingShape" mc:Ignorable="w14 w15 w16se wp14">
+<w:endnotes xmlns:wpc="http://schemas.microsoft.com/office/word/2010/wordprocessingCanvas" xmlns:cx="http://schemas.microsoft.com/office/drawing/2014/chartex" xmlns:cx1="http://schemas.microsoft.com/office/drawing/2015/9/8/chartex" xmlns:cx2="http://schemas.microsoft.com/office/drawing/2015/10/21/chartex" xmlns:cx3="http://schemas.microsoft.com/office/drawing/2016/5/9/chartex" xmlns:cx4="http://schemas.microsoft.com/office/drawing/2016/5/10/chartex" xmlns:cx5="http://schemas.microsoft.com/office/drawing/2016/5/11/chartex" xmlns:cx6="http://schemas.microsoft.com/office/drawing/2016/5/12/chartex" xmlns:cx7="http://schemas.microsoft.com/office/drawing/2016/5/13/chartex" xmlns:cx8="http://schemas.microsoft.com/office/drawing/2016/5/14/chartex" xmlns:mc="http://schemas.openxmlformats.org/markup-compatibility/2006" xmlns:aink="http://schemas.microsoft.com/office/drawing/2016/ink" xmlns:am3d="http://schemas.microsoft.com/office/drawing/2017/model3d" xmlns:o="urn:schemas-microsoft-com:office:office" xmlns:oel="http://schemas.microsoft.com/office/2019/extlst" xmlns:r="http://schemas.openxmlformats.org/officeDocument/2006/relationships" xmlns:m="http://schemas.openxmlformats.org/officeDocument/2006/math" xmlns:v="urn:schemas-microsoft-com:vml" xmlns:wp14="http://schemas.microsoft.com/office/word/2010/wordprocessingDrawing" xmlns:wp="http://schemas.openxmlformats.org/drawingml/2006/wordprocessingDrawing" xmlns:w10="urn:schemas-microsoft-com:office:word" xmlns:w="http://schemas.openxmlformats.org/wordprocessingml/2006/main" xmlns:w14="http://schemas.microsoft.com/office/word/2010/wordml" xmlns:w15="http://schemas.microsoft.com/office/word/2012/wordml" xmlns:w16cex="http://schemas.microsoft.com/office/word/2018/wordml/cex" xmlns:w16cid="http://schemas.microsoft.com/office/word/2016/wordml/cid" xmlns:w16="http://schemas.microsoft.com/office/word/2018/wordml" xmlns:w16du="http://schemas.microsoft.com/office/word/2023/wordml/word16du" xmlns:w16sdtdh="http://schemas.microsoft.com/office/word/2020/wordml/sdtdatahash" xmlns:w16sdtfl="http://schemas.microsoft.com/office/word/2024/wordml/sdtformatlock" xmlns:w16se="http://schemas.microsoft.com/office/word/2015/wordml/symex" xmlns:wpg="http://schemas.microsoft.com/office/word/2010/wordprocessingGroup" xmlns:wpi="http://schemas.microsoft.com/office/word/2010/wordprocessingInk" xmlns:wne="http://schemas.microsoft.com/office/word/2006/wordml" xmlns:wps="http://schemas.microsoft.com/office/word/2010/wordprocessingShape" mc:Ignorable="w14 w15 w16se w16cid w16 w16cex w16sdtdh w16sdtfl w16du wp14">
   <w:endnote w:type="separator" w:id="-1">
     <w:p>
       <w:pPr>
@@ -1562,7 +2061,7 @@
 </file>
 
 <file path=word/footnotes.xml><?xml version="1.0" encoding="utf-8"?>
-<w:footnotes xmlns:wpc="http://schemas.microsoft.com/office/word/2010/wordprocessingCanvas" xmlns:cx="http://schemas.microsoft.com/office/drawing/2014/chartex" xmlns:mc="http://schemas.openxmlformats.org/markup-compatibility/2006" xmlns:o="urn:schemas-microsoft-com:office:office" xmlns:r="http://schemas.openxmlformats.org/officeDocument/2006/relationships" xmlns:m="http://schemas.openxmlformats.org/officeDocument/2006/math" xmlns:v="urn:schemas-microsoft-com:vml" xmlns:wp14="http://schemas.microsoft.com/office/word/2010/wordprocessingDrawing" xmlns:wp="http://schemas.openxmlformats.org/drawingml/2006/wordprocessingDrawing" xmlns:w10="urn:schemas-microsoft-com:office:word" xmlns:w="http://schemas.openxmlformats.org/wordprocessingml/2006/main" xmlns:w14="http://schemas.microsoft.com/office/word/2010/wordml" xmlns:w15="http://schemas.microsoft.com/office/word/2012/wordml" xmlns:w16se="http://schemas.microsoft.com/office/word/2015/wordml/symex" xmlns:wpg="http://schemas.microsoft.com/office/word/2010/wordprocessingGroup" xmlns:wpi="http://schemas.microsoft.com/office/word/2010/wordprocessingInk" xmlns:wne="http://schemas.microsoft.com/office/word/2006/wordml" xmlns:wps="http://schemas.microsoft.com/office/word/2010/wordprocessingShape" mc:Ignorable="w14 w15 w16se wp14">
+<w:footnotes xmlns:wpc="http://schemas.microsoft.com/office/word/2010/wordprocessingCanvas" xmlns:cx="http://schemas.microsoft.com/office/drawing/2014/chartex" xmlns:cx1="http://schemas.microsoft.com/office/drawing/2015/9/8/chartex" xmlns:cx2="http://schemas.microsoft.com/office/drawing/2015/10/21/chartex" xmlns:cx3="http://schemas.microsoft.com/office/drawing/2016/5/9/chartex" xmlns:cx4="http://schemas.microsoft.com/office/drawing/2016/5/10/chartex" xmlns:cx5="http://schemas.microsoft.com/office/drawing/2016/5/11/chartex" xmlns:cx6="http://schemas.microsoft.com/office/drawing/2016/5/12/chartex" xmlns:cx7="http://schemas.microsoft.com/office/drawing/2016/5/13/chartex" xmlns:cx8="http://schemas.microsoft.com/office/drawing/2016/5/14/chartex" xmlns:mc="http://schemas.openxmlformats.org/markup-compatibility/2006" xmlns:aink="http://schemas.microsoft.com/office/drawing/2016/ink" xmlns:am3d="http://schemas.microsoft.com/office/drawing/2017/model3d" xmlns:o="urn:schemas-microsoft-com:office:office" xmlns:oel="http://schemas.microsoft.com/office/2019/extlst" xmlns:r="http://schemas.openxmlformats.org/officeDocument/2006/relationships" xmlns:m="http://schemas.openxmlformats.org/officeDocument/2006/math" xmlns:v="urn:schemas-microsoft-com:vml" xmlns:wp14="http://schemas.microsoft.com/office/word/2010/wordprocessingDrawing" xmlns:wp="http://schemas.openxmlformats.org/drawingml/2006/wordprocessingDrawing" xmlns:w10="urn:schemas-microsoft-com:office:word" xmlns:w="http://schemas.openxmlformats.org/wordprocessingml/2006/main" xmlns:w14="http://schemas.microsoft.com/office/word/2010/wordml" xmlns:w15="http://schemas.microsoft.com/office/word/2012/wordml" xmlns:w16cex="http://schemas.microsoft.com/office/word/2018/wordml/cex" xmlns:w16cid="http://schemas.microsoft.com/office/word/2016/wordml/cid" xmlns:w16="http://schemas.microsoft.com/office/word/2018/wordml" xmlns:w16du="http://schemas.microsoft.com/office/word/2023/wordml/word16du" xmlns:w16sdtdh="http://schemas.microsoft.com/office/word/2020/wordml/sdtdatahash" xmlns:w16sdtfl="http://schemas.microsoft.com/office/word/2024/wordml/sdtformatlock" xmlns:w16se="http://schemas.microsoft.com/office/word/2015/wordml/symex" xmlns:wpg="http://schemas.microsoft.com/office/word/2010/wordprocessingGroup" xmlns:wpi="http://schemas.microsoft.com/office/word/2010/wordprocessingInk" xmlns:wne="http://schemas.microsoft.com/office/word/2006/wordml" xmlns:wps="http://schemas.microsoft.com/office/word/2010/wordprocessingShape" mc:Ignorable="w14 w15 w16se w16cid w16 w16cex w16sdtdh w16sdtfl w16du wp14">
   <w:footnote w:type="separator" w:id="-1">
     <w:p>
       <w:pPr>
@@ -1587,7 +2086,7 @@
 </file>
 
 <file path=word/styles.xml><?xml version="1.0" encoding="utf-8"?>
-<w:styles xmlns:mc="http://schemas.openxmlformats.org/markup-compatibility/2006" xmlns:r="http://schemas.openxmlformats.org/officeDocument/2006/relationships" xmlns:w="http://schemas.openxmlformats.org/wordprocessingml/2006/main" xmlns:w14="http://schemas.microsoft.com/office/word/2010/wordml" xmlns:w15="http://schemas.microsoft.com/office/word/2012/wordml" xmlns:w16se="http://schemas.microsoft.com/office/word/2015/wordml/symex" mc:Ignorable="w14 w15 w16se">
+<w:styles xmlns:mc="http://schemas.openxmlformats.org/markup-compatibility/2006" xmlns:r="http://schemas.openxmlformats.org/officeDocument/2006/relationships" xmlns:w="http://schemas.openxmlformats.org/wordprocessingml/2006/main" xmlns:w14="http://schemas.microsoft.com/office/word/2010/wordml" xmlns:w15="http://schemas.microsoft.com/office/word/2012/wordml" xmlns:w16cex="http://schemas.microsoft.com/office/word/2018/wordml/cex" xmlns:w16cid="http://schemas.microsoft.com/office/word/2016/wordml/cid" xmlns:w16="http://schemas.microsoft.com/office/word/2018/wordml" xmlns:w16du="http://schemas.microsoft.com/office/word/2023/wordml/word16du" xmlns:w16sdtdh="http://schemas.microsoft.com/office/word/2020/wordml/sdtdatahash" xmlns:w16sdtfl="http://schemas.microsoft.com/office/word/2024/wordml/sdtformatlock" xmlns:w16se="http://schemas.microsoft.com/office/word/2015/wordml/symex" mc:Ignorable="w14 w15 w16se w16cid w16 w16cex w16sdtdh w16sdtfl w16du">
   <w:docDefaults>
     <w:rPrDefault>
       <w:rPr>
@@ -1603,7 +2102,7 @@
       </w:pPr>
     </w:pPrDefault>
   </w:docDefaults>
-  <w:latentStyles w:defLockedState="0" w:defUIPriority="99" w:defSemiHidden="0" w:defUnhideWhenUsed="0" w:defQFormat="0" w:count="371">
+  <w:latentStyles w:defLockedState="0" w:defUIPriority="99" w:defSemiHidden="0" w:defUnhideWhenUsed="0" w:defQFormat="0" w:count="376">
     <w:lsdException w:name="Normal" w:uiPriority="0" w:qFormat="1"/>
     <w:lsdException w:name="heading 1" w:uiPriority="9" w:qFormat="1"/>
     <w:lsdException w:name="heading 2" w:semiHidden="1" w:uiPriority="9" w:unhideWhenUsed="1" w:qFormat="1"/>
@@ -1975,6 +2474,11 @@
     <w:lsdException w:name="List Table 5 Dark Accent 6" w:uiPriority="50"/>
     <w:lsdException w:name="List Table 6 Colorful Accent 6" w:uiPriority="51"/>
     <w:lsdException w:name="List Table 7 Colorful Accent 6" w:uiPriority="52"/>
+    <w:lsdException w:name="Mention" w:semiHidden="1" w:unhideWhenUsed="1"/>
+    <w:lsdException w:name="Smart Hyperlink" w:semiHidden="1" w:unhideWhenUsed="1"/>
+    <w:lsdException w:name="Hashtag" w:semiHidden="1" w:unhideWhenUsed="1"/>
+    <w:lsdException w:name="Unresolved Mention" w:semiHidden="1" w:unhideWhenUsed="1"/>
+    <w:lsdException w:name="Smart Link" w:semiHidden="1" w:unhideWhenUsed="1"/>
   </w:latentStyles>
   <w:style w:type="paragraph" w:default="1" w:styleId="a">
     <w:name w:val="Normal"/>

</xml_diff>